<commit_message>
Add DA-2K evaluation pipeline and reproduction report
</commit_message>
<xml_diff>
--- a/paper/סיכום של המאמר Depth Anything V2.docx
+++ b/paper/סיכום של המאמר Depth Anything V2.docx
@@ -78,7 +78,23 @@
           <w:rFonts w:hint="cs"/>
           <w:rtl/>
         </w:rPr>
-        <w:t xml:space="preserve">על דאטא של תמונות אמיתיות שהתוויות שלהם לא היו כל כך מדויקות בגלל שהמכשירים שמודדים עומק לתמונה ברמת כל פיקסל, הם לא מדויקים. </w:t>
+        <w:t xml:space="preserve">על </w:t>
+      </w:r>
+      <w:proofErr w:type="spellStart"/>
+      <w:r>
+        <w:rPr>
+          <w:rFonts w:hint="cs"/>
+          <w:rtl/>
+        </w:rPr>
+        <w:t>דאטא</w:t>
+      </w:r>
+      <w:proofErr w:type="spellEnd"/>
+      <w:r>
+        <w:rPr>
+          <w:rFonts w:hint="cs"/>
+          <w:rtl/>
+        </w:rPr>
+        <w:t xml:space="preserve"> של תמונות אמיתיות שהתוויות שלהם לא היו כל כך מדויקות בגלל שהמכשירים שמודדים עומק לתמונה ברמת כל פיקסל, הם לא מדויקים. </w:t>
       </w:r>
       <w:r>
         <w:rPr>
@@ -90,7 +106,6 @@
     <w:p>
       <w:pPr>
         <w:rPr>
-          <w:rFonts w:hint="cs"/>
           <w:rtl/>
         </w:rPr>
       </w:pPr>
@@ -99,7 +114,21 @@
           <w:rFonts w:hint="cs"/>
           <w:rtl/>
         </w:rPr>
-        <w:t xml:space="preserve">חשוב לציין שלתמנות אמיתיות יש את החסרונות שהם עם תיוג רועש. ועוד חיסרון שהם מתעלמות מפרטים קטנים. </w:t>
+        <w:t>חשוב לציין שלתמ</w:t>
+      </w:r>
+      <w:r>
+        <w:rPr>
+          <w:rFonts w:hint="cs"/>
+          <w:rtl/>
+        </w:rPr>
+        <w:t>ו</w:t>
+      </w:r>
+      <w:r>
+        <w:rPr>
+          <w:rFonts w:hint="cs"/>
+          <w:rtl/>
+        </w:rPr>
+        <w:t xml:space="preserve">נות אמיתיות יש את החסרונות שהם עם תיוג רועש. ועוד חיסרון שהם מתעלמות מפרטים קטנים. </w:t>
       </w:r>
       <w:r>
         <w:rPr>
@@ -138,13 +167,26 @@
           <w:rFonts w:hint="cs"/>
           <w:rtl/>
         </w:rPr>
-        <w:t>המאמר פוסל גם שימוש בשניהם ביחד (חלק מהדאטא אמיתי וחלק סינתטי) ואומר שזה לא יוצא טוב. בנוסף הוא פוסל גם שימוש לעומק יחסי ישירות מ-</w:t>
-      </w:r>
-      <w:r>
-        <w:t xml:space="preserve"> </w:t>
-      </w:r>
-      <w:r>
-        <w:t>DINO-V2-G</w:t>
+        <w:t xml:space="preserve">המאמר פוסל גם שימוש בשניהם ביחד (חלק </w:t>
+      </w:r>
+      <w:proofErr w:type="spellStart"/>
+      <w:r>
+        <w:rPr>
+          <w:rFonts w:hint="cs"/>
+          <w:rtl/>
+        </w:rPr>
+        <w:t>מהדאטא</w:t>
+      </w:r>
+      <w:proofErr w:type="spellEnd"/>
+      <w:r>
+        <w:rPr>
+          <w:rFonts w:hint="cs"/>
+          <w:rtl/>
+        </w:rPr>
+        <w:t xml:space="preserve"> אמיתי וחלק סינתטי) ואומר שזה לא יוצא טוב. בנוסף הוא פוסל גם שימוש לעומק יחסי ישירות מ-</w:t>
+      </w:r>
+      <w:r>
+        <w:t xml:space="preserve"> DINO-V2-G</w:t>
       </w:r>
       <w:r>
         <w:rPr>
@@ -194,7 +236,23 @@
           <w:rFonts w:hint="cs"/>
           <w:rtl/>
         </w:rPr>
-        <w:t xml:space="preserve"> כללי שיודע לעשות אמבדינג לתמונות. ועשו לו </w:t>
+        <w:t xml:space="preserve"> כללי שיודע לעשות </w:t>
+      </w:r>
+      <w:proofErr w:type="spellStart"/>
+      <w:r>
+        <w:rPr>
+          <w:rFonts w:hint="cs"/>
+          <w:rtl/>
+        </w:rPr>
+        <w:t>אמבדינג</w:t>
+      </w:r>
+      <w:proofErr w:type="spellEnd"/>
+      <w:r>
+        <w:rPr>
+          <w:rFonts w:hint="cs"/>
+          <w:rtl/>
+        </w:rPr>
+        <w:t xml:space="preserve"> לתמונות. ועשו לו </w:t>
       </w:r>
       <w:r>
         <w:t>fine tuning</w:t>
@@ -218,7 +276,39 @@
           <w:rFonts w:hint="cs"/>
           <w:rtl/>
         </w:rPr>
-        <w:t xml:space="preserve"> זה היה עם גודל באצ' של 64 ועם 160 אלף! איטרציות.</w:t>
+        <w:t xml:space="preserve"> זה היה עם גודל </w:t>
+      </w:r>
+      <w:proofErr w:type="spellStart"/>
+      <w:r>
+        <w:rPr>
+          <w:rFonts w:hint="cs"/>
+          <w:rtl/>
+        </w:rPr>
+        <w:t>באצ</w:t>
+      </w:r>
+      <w:proofErr w:type="spellEnd"/>
+      <w:r>
+        <w:rPr>
+          <w:rFonts w:hint="cs"/>
+          <w:rtl/>
+        </w:rPr>
+        <w:t xml:space="preserve">' של 64 ועם 160 אלף! </w:t>
+      </w:r>
+      <w:proofErr w:type="spellStart"/>
+      <w:r>
+        <w:rPr>
+          <w:rFonts w:hint="cs"/>
+          <w:rtl/>
+        </w:rPr>
+        <w:t>איטרציות</w:t>
+      </w:r>
+      <w:proofErr w:type="spellEnd"/>
+      <w:r>
+        <w:rPr>
+          <w:rFonts w:hint="cs"/>
+          <w:rtl/>
+        </w:rPr>
+        <w:t>.</w:t>
       </w:r>
       <w:r>
         <w:rPr>
@@ -253,7 +343,23 @@
           <w:rFonts w:hint="cs"/>
           <w:rtl/>
         </w:rPr>
-        <w:t xml:space="preserve"> ואז אימנו מודל תלמיד על הדאטא-סט שמכיל את התמונות האמתיות שהמודל המורה (</w:t>
+        <w:t xml:space="preserve"> ואז אימנו מודל תלמיד על </w:t>
+      </w:r>
+      <w:proofErr w:type="spellStart"/>
+      <w:r>
+        <w:rPr>
+          <w:rFonts w:hint="cs"/>
+          <w:rtl/>
+        </w:rPr>
+        <w:t>הדאטא</w:t>
+      </w:r>
+      <w:proofErr w:type="spellEnd"/>
+      <w:r>
+        <w:rPr>
+          <w:rFonts w:hint="cs"/>
+          <w:rtl/>
+        </w:rPr>
+        <w:t>-סט שמכיל את התמונות האמתיות שהמודל המורה (</w:t>
       </w:r>
       <w:r>
         <w:rPr>
@@ -276,7 +382,39 @@
           <w:rFonts w:hint="cs"/>
           <w:rtl/>
         </w:rPr>
-        <w:t>האימון היה עם גודל באצ' של 192 ועם 480 אלף איטרציות.</w:t>
+        <w:t xml:space="preserve">האימון היה עם גודל </w:t>
+      </w:r>
+      <w:proofErr w:type="spellStart"/>
+      <w:r>
+        <w:rPr>
+          <w:rFonts w:hint="cs"/>
+          <w:rtl/>
+        </w:rPr>
+        <w:t>באצ</w:t>
+      </w:r>
+      <w:proofErr w:type="spellEnd"/>
+      <w:r>
+        <w:rPr>
+          <w:rFonts w:hint="cs"/>
+          <w:rtl/>
+        </w:rPr>
+        <w:t xml:space="preserve">' של 192 ועם 480 אלף </w:t>
+      </w:r>
+      <w:proofErr w:type="spellStart"/>
+      <w:r>
+        <w:rPr>
+          <w:rFonts w:hint="cs"/>
+          <w:rtl/>
+        </w:rPr>
+        <w:t>איטרציות</w:t>
+      </w:r>
+      <w:proofErr w:type="spellEnd"/>
+      <w:r>
+        <w:rPr>
+          <w:rFonts w:hint="cs"/>
+          <w:rtl/>
+        </w:rPr>
+        <w:t>.</w:t>
       </w:r>
     </w:p>
     <w:p>
@@ -285,21 +423,69 @@
           <w:rFonts w:hint="cs"/>
           <w:rtl/>
         </w:rPr>
-        <w:t xml:space="preserve">בנוסף- הם טוענים שה-בנצ'מארקים שיש היום לא מדויקים כי מראש הם לוקחים למבחן תמונות שהתיוג שלהם לא נכון. </w:t>
-      </w:r>
-      <w:r>
-        <w:rPr>
-          <w:rFonts w:hint="cs"/>
-          <w:rtl/>
-        </w:rPr>
-        <w:t xml:space="preserve">בנוסף יש בהם רק סצנות מסוימות, ואין כיסוי נרחב. וגם הם מכילים רק תמנות עם רזולוציה נמוכה. </w:t>
-      </w:r>
-      <w:r>
-        <w:rPr>
-          <w:rFonts w:hint="cs"/>
-          <w:rtl/>
-        </w:rPr>
-        <w:t xml:space="preserve">ולכן הם יצרו בנצ'מארק חדש בשם </w:t>
+        <w:t>בנוסף- הם טוענים שה-</w:t>
+      </w:r>
+      <w:proofErr w:type="spellStart"/>
+      <w:r>
+        <w:rPr>
+          <w:rFonts w:hint="cs"/>
+          <w:rtl/>
+        </w:rPr>
+        <w:t>בנצ'מארקים</w:t>
+      </w:r>
+      <w:proofErr w:type="spellEnd"/>
+      <w:r>
+        <w:rPr>
+          <w:rFonts w:hint="cs"/>
+          <w:rtl/>
+        </w:rPr>
+        <w:t xml:space="preserve"> שיש היום לא מדויקים כי מראש הם לוקחים למבחן תמונות שהתיוג שלהם לא נכון. </w:t>
+      </w:r>
+      <w:r>
+        <w:rPr>
+          <w:rFonts w:hint="cs"/>
+          <w:rtl/>
+        </w:rPr>
+        <w:t xml:space="preserve">בנוסף יש בהם רק סצנות מסוימות, ואין כיסוי נרחב. וגם הם מכילים רק </w:t>
+      </w:r>
+      <w:proofErr w:type="spellStart"/>
+      <w:r>
+        <w:rPr>
+          <w:rFonts w:hint="cs"/>
+          <w:rtl/>
+        </w:rPr>
+        <w:t>תמנות</w:t>
+      </w:r>
+      <w:proofErr w:type="spellEnd"/>
+      <w:r>
+        <w:rPr>
+          <w:rFonts w:hint="cs"/>
+          <w:rtl/>
+        </w:rPr>
+        <w:t xml:space="preserve"> עם רזולוציה נמוכה. </w:t>
+      </w:r>
+      <w:r>
+        <w:rPr>
+          <w:rFonts w:hint="cs"/>
+          <w:rtl/>
+        </w:rPr>
+        <w:t xml:space="preserve">ולכן הם יצרו </w:t>
+      </w:r>
+      <w:proofErr w:type="spellStart"/>
+      <w:r>
+        <w:rPr>
+          <w:rFonts w:hint="cs"/>
+          <w:rtl/>
+        </w:rPr>
+        <w:t>בנצ'מארק</w:t>
+      </w:r>
+      <w:proofErr w:type="spellEnd"/>
+      <w:r>
+        <w:rPr>
+          <w:rFonts w:hint="cs"/>
+          <w:rtl/>
+        </w:rPr>
+        <w:t xml:space="preserve"> חדש בשם </w:t>
       </w:r>
       <w:r>
         <w:rPr>
@@ -315,8 +501,17 @@
           <w:rFonts w:hint="cs"/>
           <w:rtl/>
         </w:rPr>
-        <w:t>. יש שם כ-1000 תמנות</w:t>
-      </w:r>
+        <w:t xml:space="preserve">. יש שם כ-1000 </w:t>
+      </w:r>
+      <w:proofErr w:type="spellStart"/>
+      <w:r>
+        <w:rPr>
+          <w:rFonts w:hint="cs"/>
+          <w:rtl/>
+        </w:rPr>
+        <w:t>תמנות</w:t>
+      </w:r>
+      <w:proofErr w:type="spellEnd"/>
       <w:r>
         <w:rPr>
           <w:rFonts w:hint="cs"/>
@@ -325,17 +520,86 @@
         <w:t xml:space="preserve"> מ-</w:t>
       </w:r>
       <w:r>
+        <w:t xml:space="preserve"> Flickr</w:t>
+      </w:r>
+      <w:r>
+        <w:rPr>
+          <w:rFonts w:hint="cs"/>
+          <w:rtl/>
+        </w:rPr>
+        <w:t>.</w:t>
+      </w:r>
+      <w:r>
+        <w:rPr>
+          <w:rFonts w:hint="cs"/>
+          <w:rtl/>
+        </w:rPr>
         <w:t xml:space="preserve"> </w:t>
       </w:r>
       <w:r>
-        <w:t>Flickr</w:t>
-      </w:r>
-      <w:r>
-        <w:rPr>
-          <w:rFonts w:hint="cs"/>
-          <w:rtl/>
-        </w:rPr>
-        <w:t>.</w:t>
+        <w:rPr>
+          <w:rFonts w:hint="cs"/>
+          <w:rtl/>
+        </w:rPr>
+        <w:t>ו</w:t>
+      </w:r>
+      <w:r>
+        <w:rPr>
+          <w:rFonts w:hint="cs"/>
+          <w:rtl/>
+        </w:rPr>
+        <w:t xml:space="preserve">עושים את המבחן ע"י שלוקחים שתי נקודות מתמונה כלשהיא, ושואלים את המודל </w:t>
+      </w:r>
+      <w:r>
+        <w:rPr>
+          <w:rFonts w:hint="cs"/>
+          <w:rtl/>
+        </w:rPr>
+        <w:t>מה העומק היחסי בין שתי הנקודות. כלומר איזו נקודה מבין שתי הנקודות, יותר קרובה למצלמה.</w:t>
+      </w:r>
+      <w:r>
+        <w:rPr>
+          <w:rtl/>
+        </w:rPr>
+        <w:br/>
+      </w:r>
+      <w:r>
+        <w:rPr>
+          <w:rtl/>
+        </w:rPr>
+        <w:br/>
+      </w:r>
+      <w:r>
+        <w:rPr>
+          <w:rFonts w:hint="cs"/>
+          <w:rtl/>
+        </w:rPr>
+        <w:t xml:space="preserve">הם מראים שכאשר בדקו את </w:t>
+      </w:r>
+      <w:r>
+        <w:rPr>
+          <w:rFonts w:hint="cs"/>
+        </w:rPr>
+        <w:t>V</w:t>
+      </w:r>
+      <w:r>
+        <w:t>1</w:t>
+      </w:r>
+      <w:r>
+        <w:rPr>
+          <w:rFonts w:hint="cs"/>
+          <w:rtl/>
+        </w:rPr>
+        <w:t xml:space="preserve"> ואת </w:t>
+      </w:r>
+      <w:r>
+        <w:rPr>
+          <w:rFonts w:hint="cs"/>
+        </w:rPr>
+        <w:t>V</w:t>
+      </w:r>
+      <w:r>
+        <w:t>2</w:t>
       </w:r>
       <w:r>
         <w:rPr>
@@ -344,45 +608,50 @@
         </w:rPr>
         <w:t xml:space="preserve"> </w:t>
       </w:r>
-      <w:r>
-        <w:rPr>
-          <w:rFonts w:hint="cs"/>
-          <w:rtl/>
-        </w:rPr>
-        <w:t>ו</w:t>
-      </w:r>
-      <w:r>
-        <w:rPr>
-          <w:rFonts w:hint="cs"/>
-          <w:rtl/>
-        </w:rPr>
-        <w:t xml:space="preserve">עושים את המבחן ע"י שלוקחים שתי נקודות מתמונה כלשהיא, ושואלים את המודל </w:t>
-      </w:r>
-      <w:r>
-        <w:rPr>
-          <w:rFonts w:hint="cs"/>
-          <w:rtl/>
-        </w:rPr>
-        <w:t>מה העומק היחסי בין שתי הנקודות. כלומר איזו נקודה מבין שתי הנקודות, יותר קרובה למצלמה.</w:t>
-      </w:r>
-      <w:r>
-        <w:rPr>
-          <w:rtl/>
-        </w:rPr>
-        <w:br/>
-      </w:r>
-      <w:r>
-        <w:rPr>
-          <w:rtl/>
-        </w:rPr>
-        <w:br/>
-      </w:r>
-      <w:r>
-        <w:rPr>
-          <w:rFonts w:hint="cs"/>
-          <w:rtl/>
-        </w:rPr>
-        <w:t xml:space="preserve">הם מראים שכאשר בדקו את </w:t>
+      <w:proofErr w:type="spellStart"/>
+      <w:r>
+        <w:rPr>
+          <w:rFonts w:hint="cs"/>
+          <w:rtl/>
+        </w:rPr>
+        <w:t>בבצ'מארקים</w:t>
+      </w:r>
+      <w:proofErr w:type="spellEnd"/>
+      <w:r>
+        <w:rPr>
+          <w:rFonts w:hint="cs"/>
+          <w:rtl/>
+        </w:rPr>
+        <w:t xml:space="preserve"> הישנים:</w:t>
+      </w:r>
+      <w:r>
+        <w:rPr>
+          <w:rFonts w:hint="cs"/>
+        </w:rPr>
+        <w:t xml:space="preserve"> </w:t>
+      </w:r>
+      <w:r>
+        <w:rPr>
+          <w:rFonts w:hint="cs"/>
+          <w:rtl/>
+        </w:rPr>
+        <w:t xml:space="preserve"> לא גילו כל כך הבדל. אבל כאשר השוו </w:t>
+      </w:r>
+      <w:proofErr w:type="spellStart"/>
+      <w:r>
+        <w:rPr>
+          <w:rFonts w:hint="cs"/>
+          <w:rtl/>
+        </w:rPr>
+        <w:t>בבנצ'מאר'ק</w:t>
+      </w:r>
+      <w:proofErr w:type="spellEnd"/>
+      <w:r>
+        <w:rPr>
+          <w:rFonts w:hint="cs"/>
+          <w:rtl/>
+        </w:rPr>
+        <w:t xml:space="preserve"> החדש את </w:t>
       </w:r>
       <w:r>
         <w:rPr>
@@ -391,6 +660,22 @@
         <w:t>V</w:t>
       </w:r>
       <w:r>
+        <w:t>2</w:t>
+      </w:r>
+      <w:r>
+        <w:rPr>
+          <w:rFonts w:hint="cs"/>
+          <w:rtl/>
+        </w:rPr>
+        <w:t xml:space="preserve"> מול </w:t>
+      </w:r>
+      <w:r>
+        <w:rPr>
+          <w:rFonts w:hint="cs"/>
+        </w:rPr>
+        <w:t>V</w:t>
+      </w:r>
+      <w:r>
         <w:t>1</w:t>
       </w:r>
       <w:r>
@@ -398,67 +683,6 @@
           <w:rFonts w:hint="cs"/>
           <w:rtl/>
         </w:rPr>
-        <w:t xml:space="preserve"> ואת </w:t>
-      </w:r>
-      <w:r>
-        <w:rPr>
-          <w:rFonts w:hint="cs"/>
-        </w:rPr>
-        <w:t>V</w:t>
-      </w:r>
-      <w:r>
-        <w:t>2</w:t>
-      </w:r>
-      <w:r>
-        <w:rPr>
-          <w:rFonts w:hint="cs"/>
-          <w:rtl/>
-        </w:rPr>
-        <w:t xml:space="preserve"> בבצ'מארקים הישנים:</w:t>
-      </w:r>
-      <w:r>
-        <w:rPr>
-          <w:rFonts w:hint="cs"/>
-        </w:rPr>
-        <w:t xml:space="preserve"> </w:t>
-      </w:r>
-      <w:r>
-        <w:rPr>
-          <w:rFonts w:hint="cs"/>
-          <w:rtl/>
-        </w:rPr>
-        <w:t xml:space="preserve"> לא גילו כל כך הבדל. אבל כאשר השוו בבנצ'מאר'ק החדש את </w:t>
-      </w:r>
-      <w:r>
-        <w:rPr>
-          <w:rFonts w:hint="cs"/>
-        </w:rPr>
-        <w:t>V</w:t>
-      </w:r>
-      <w:r>
-        <w:t>2</w:t>
-      </w:r>
-      <w:r>
-        <w:rPr>
-          <w:rFonts w:hint="cs"/>
-          <w:rtl/>
-        </w:rPr>
-        <w:t xml:space="preserve"> מול </w:t>
-      </w:r>
-      <w:r>
-        <w:rPr>
-          <w:rFonts w:hint="cs"/>
-        </w:rPr>
-        <w:t>V</w:t>
-      </w:r>
-      <w:r>
-        <w:t>1</w:t>
-      </w:r>
-      <w:r>
-        <w:rPr>
-          <w:rFonts w:hint="cs"/>
-          <w:rtl/>
-        </w:rPr>
         <w:t xml:space="preserve"> ושאר המודלים שיודעים לחזות עומק לתמונה כמו </w:t>
       </w:r>
       <w:r>
@@ -471,9 +695,11 @@
         </w:rPr>
         <w:t xml:space="preserve">, </w:t>
       </w:r>
+      <w:proofErr w:type="spellStart"/>
       <w:r>
         <w:t>Geowizard</w:t>
       </w:r>
+      <w:proofErr w:type="spellEnd"/>
       <w:r>
         <w:rPr>
           <w:rFonts w:hint="cs"/>
@@ -511,7 +737,6 @@
     <w:p>
       <w:pPr>
         <w:rPr>
-          <w:rFonts w:hint="cs"/>
           <w:rtl/>
         </w:rPr>
       </w:pPr>
@@ -520,11 +745,45 @@
           <w:rFonts w:hint="cs"/>
           <w:rtl/>
         </w:rPr>
-        <w:t xml:space="preserve">עכשיו הם מדברים על עומק במטרים לכל אובייקט בתמונה. כלומר להגיד על כל אוביקט בתמונה, מה המרחק שלו במטרים מהמצלמה. ולא רק עומק יחסי בין אוביקטים. בשביל זה הם לקחו את המודל </w:t>
-      </w:r>
+        <w:t xml:space="preserve">עכשיו הם מדברים על עומק במטרים לכל אובייקט בתמונה. כלומר להגיד על כל </w:t>
+      </w:r>
+      <w:proofErr w:type="spellStart"/>
+      <w:r>
+        <w:rPr>
+          <w:rFonts w:hint="cs"/>
+          <w:rtl/>
+        </w:rPr>
+        <w:t>אוביקט</w:t>
+      </w:r>
+      <w:proofErr w:type="spellEnd"/>
+      <w:r>
+        <w:rPr>
+          <w:rFonts w:hint="cs"/>
+          <w:rtl/>
+        </w:rPr>
+        <w:t xml:space="preserve"> בתמונה, מה המרחק שלו במטרים מהמצלמה. ולא רק עומק יחסי בין </w:t>
+      </w:r>
+      <w:proofErr w:type="spellStart"/>
+      <w:r>
+        <w:rPr>
+          <w:rFonts w:hint="cs"/>
+          <w:rtl/>
+        </w:rPr>
+        <w:t>אוביקטים</w:t>
+      </w:r>
+      <w:proofErr w:type="spellEnd"/>
+      <w:r>
+        <w:rPr>
+          <w:rFonts w:hint="cs"/>
+          <w:rtl/>
+        </w:rPr>
+        <w:t xml:space="preserve">. בשביל זה הם לקחו את המודל </w:t>
+      </w:r>
+      <w:proofErr w:type="spellStart"/>
       <w:r>
         <w:t>ZoeDepth</w:t>
       </w:r>
+      <w:proofErr w:type="spellEnd"/>
       <w:r>
         <w:rPr>
           <w:rFonts w:hint="cs"/>
@@ -532,9 +791,11 @@
         </w:rPr>
         <w:t xml:space="preserve"> שיודע לעשות את זה. אבל במקום שהמודל יהיה מבוסס על </w:t>
       </w:r>
+      <w:proofErr w:type="spellStart"/>
       <w:r>
         <w:t>MiDaS</w:t>
       </w:r>
+      <w:proofErr w:type="spellEnd"/>
       <w:r>
         <w:rPr>
           <w:rFonts w:hint="cs"/>
@@ -563,7 +824,15 @@
           <w:rFonts w:hint="cs"/>
           <w:rtl/>
         </w:rPr>
-        <w:t>הם הישוו את זה בב</w:t>
+        <w:t xml:space="preserve">הם הישוו את זה </w:t>
+      </w:r>
+      <w:proofErr w:type="spellStart"/>
+      <w:r>
+        <w:rPr>
+          <w:rFonts w:hint="cs"/>
+          <w:rtl/>
+        </w:rPr>
+        <w:t>בב</w:t>
       </w:r>
       <w:r>
         <w:rPr>
@@ -577,7 +846,15 @@
           <w:rFonts w:hint="cs"/>
           <w:rtl/>
         </w:rPr>
-        <w:t>צ'מארקים קיימים</w:t>
+        <w:t>צ'מארקים</w:t>
+      </w:r>
+      <w:proofErr w:type="spellEnd"/>
+      <w:r>
+        <w:rPr>
+          <w:rFonts w:hint="cs"/>
+          <w:rtl/>
+        </w:rPr>
+        <w:t xml:space="preserve"> קיימים</w:t>
       </w:r>
       <w:r>
         <w:rPr>
@@ -593,9 +870,11 @@
         </w:rPr>
         <w:t xml:space="preserve"> </w:t>
       </w:r>
+      <w:proofErr w:type="spellStart"/>
       <w:r>
         <w:t>ZoeDepth</w:t>
       </w:r>
+      <w:proofErr w:type="spellEnd"/>
       <w:r>
         <w:rPr>
           <w:rFonts w:hint="cs"/>
@@ -622,9 +901,11 @@
       <w:r>
         <w:t xml:space="preserve"> </w:t>
       </w:r>
+      <w:proofErr w:type="spellStart"/>
       <w:r>
         <w:t>ZoeDepth</w:t>
       </w:r>
+      <w:proofErr w:type="spellEnd"/>
       <w:r>
         <w:rPr>
           <w:rFonts w:hint="cs"/>
@@ -632,22 +913,42 @@
         </w:rPr>
         <w:t xml:space="preserve"> הרגיל (שמבוסס על </w:t>
       </w:r>
+      <w:proofErr w:type="spellStart"/>
       <w:r>
         <w:t>MiDaS</w:t>
       </w:r>
-      <w:r>
-        <w:rPr>
-          <w:rFonts w:hint="cs"/>
-          <w:rtl/>
-        </w:rPr>
-        <w:t>), ןלעומת שאר המודלים המתחרים ב-</w:t>
+      <w:proofErr w:type="spellEnd"/>
+      <w:r>
+        <w:rPr>
+          <w:rFonts w:hint="cs"/>
+          <w:rtl/>
+        </w:rPr>
+        <w:t xml:space="preserve">), </w:t>
+      </w:r>
+      <w:proofErr w:type="spellStart"/>
+      <w:r>
+        <w:rPr>
+          <w:rFonts w:hint="cs"/>
+          <w:rtl/>
+        </w:rPr>
+        <w:t>ןלעומת</w:t>
+      </w:r>
+      <w:proofErr w:type="spellEnd"/>
+      <w:r>
+        <w:rPr>
+          <w:rFonts w:hint="cs"/>
+          <w:rtl/>
+        </w:rPr>
+        <w:t xml:space="preserve"> שאר המודלים המתחרים ב-</w:t>
       </w:r>
       <w:r>
         <w:t xml:space="preserve"> </w:t>
       </w:r>
+      <w:proofErr w:type="spellStart"/>
       <w:r>
         <w:t>ZoeDepth</w:t>
       </w:r>
+      <w:proofErr w:type="spellEnd"/>
       <w:r>
         <w:rPr>
           <w:rFonts w:hint="cs"/>
@@ -662,9 +963,11 @@
         </w:rPr>
         <w:t xml:space="preserve">רואים בתוצאות ש- </w:t>
       </w:r>
+      <w:proofErr w:type="spellStart"/>
       <w:r>
         <w:t>ZoeDepth</w:t>
       </w:r>
+      <w:proofErr w:type="spellEnd"/>
       <w:r>
         <w:rPr>
           <w:rFonts w:hint="cs"/>
@@ -718,7 +1021,6 @@
     <w:p>
       <w:pPr>
         <w:rPr>
-          <w:rFonts w:hint="cs"/>
           <w:rtl/>
         </w:rPr>
       </w:pPr>
@@ -726,7 +1028,6 @@
     <w:p>
       <w:pPr>
         <w:rPr>
-          <w:rFonts w:hint="cs"/>
           <w:rtl/>
         </w:rPr>
       </w:pPr>
@@ -752,13 +1053,13 @@
     <w:p>
       <w:pPr>
         <w:rPr>
-          <w:rFonts w:hint="cs"/>
           <w:rtl/>
         </w:rPr>
       </w:pPr>
       <w:r>
         <w:rPr>
           <w:rFonts w:cs="Arial"/>
+          <w:noProof/>
           <w:rtl/>
         </w:rPr>
         <w:lastRenderedPageBreak/>
@@ -802,7 +1103,6 @@
     <w:p>
       <w:pPr>
         <w:rPr>
-          <w:rFonts w:hint="cs"/>
           <w:rtl/>
         </w:rPr>
       </w:pPr>
@@ -810,7 +1110,6 @@
     <w:p>
       <w:pPr>
         <w:rPr>
-          <w:rFonts w:hint="cs"/>
           <w:rtl/>
         </w:rPr>
       </w:pPr>
@@ -832,7 +1131,6 @@
     <w:p>
       <w:pPr>
         <w:rPr>
-          <w:rFonts w:hint="cs"/>
           <w:rtl/>
         </w:rPr>
       </w:pPr>
@@ -867,7 +1165,23 @@
           <w:rFonts w:hint="cs"/>
           <w:rtl/>
         </w:rPr>
-        <w:t xml:space="preserve">גישה למאגר של הבנצ'מארק </w:t>
+        <w:t xml:space="preserve">גישה למאגר של </w:t>
+      </w:r>
+      <w:proofErr w:type="spellStart"/>
+      <w:r>
+        <w:rPr>
+          <w:rFonts w:hint="cs"/>
+          <w:rtl/>
+        </w:rPr>
+        <w:t>הבנצ'מארק</w:t>
+      </w:r>
+      <w:proofErr w:type="spellEnd"/>
+      <w:r>
+        <w:rPr>
+          <w:rFonts w:hint="cs"/>
+          <w:rtl/>
+        </w:rPr>
+        <w:t xml:space="preserve"> </w:t>
       </w:r>
       <w:r>
         <w:t>DA-2K</w:t>
@@ -900,7 +1214,23 @@
           <w:rFonts w:hint="cs"/>
           <w:rtl/>
         </w:rPr>
-        <w:t xml:space="preserve"> דרך פייסבוק. </w:t>
+        <w:t xml:space="preserve"> דרך </w:t>
+      </w:r>
+      <w:proofErr w:type="spellStart"/>
+      <w:r>
+        <w:rPr>
+          <w:rFonts w:hint="cs"/>
+          <w:rtl/>
+        </w:rPr>
+        <w:t>פייסבוק</w:t>
+      </w:r>
+      <w:proofErr w:type="spellEnd"/>
+      <w:r>
+        <w:rPr>
+          <w:rFonts w:hint="cs"/>
+          <w:rtl/>
+        </w:rPr>
+        <w:t xml:space="preserve">. </w:t>
       </w:r>
       <w:r>
         <w:rPr>
@@ -1017,20 +1347,52 @@
           <w:rFonts w:hint="cs"/>
           <w:rtl/>
         </w:rPr>
-        <w:t>סקריפט שטוען את הנתונים מהמאגרי נתונים.</w:t>
-      </w:r>
-      <w:r>
-        <w:rPr>
-          <w:rtl/>
-        </w:rPr>
-        <w:br/>
-      </w:r>
-      <w:r>
-        <w:rPr>
-          <w:rFonts w:hint="cs"/>
-          <w:rtl/>
-        </w:rPr>
-        <w:t>בנוסף- גישה לבנצ'מארקים הישנים היא קצת מסובכת.</w:t>
+        <w:t xml:space="preserve">סקריפט שטוען את הנתונים </w:t>
+      </w:r>
+      <w:proofErr w:type="spellStart"/>
+      <w:r>
+        <w:rPr>
+          <w:rFonts w:hint="cs"/>
+          <w:rtl/>
+        </w:rPr>
+        <w:t>מהמאגרי</w:t>
+      </w:r>
+      <w:proofErr w:type="spellEnd"/>
+      <w:r>
+        <w:rPr>
+          <w:rFonts w:hint="cs"/>
+          <w:rtl/>
+        </w:rPr>
+        <w:t xml:space="preserve"> נתונים.</w:t>
+      </w:r>
+      <w:r>
+        <w:rPr>
+          <w:rtl/>
+        </w:rPr>
+        <w:br/>
+      </w:r>
+      <w:r>
+        <w:rPr>
+          <w:rFonts w:hint="cs"/>
+          <w:rtl/>
+        </w:rPr>
+        <w:t xml:space="preserve">בנוסף- גישה </w:t>
+      </w:r>
+      <w:proofErr w:type="spellStart"/>
+      <w:r>
+        <w:rPr>
+          <w:rFonts w:hint="cs"/>
+          <w:rtl/>
+        </w:rPr>
+        <w:t>לבנצ'מארקים</w:t>
+      </w:r>
+      <w:proofErr w:type="spellEnd"/>
+      <w:r>
+        <w:rPr>
+          <w:rFonts w:hint="cs"/>
+          <w:rtl/>
+        </w:rPr>
+        <w:t xml:space="preserve"> הישנים היא קצת מסובכת.</w:t>
       </w:r>
       <w:r>
         <w:rPr>
@@ -1043,7 +1405,6 @@
     <w:p>
       <w:pPr>
         <w:rPr>
-          <w:rFonts w:hint="cs"/>
           <w:rtl/>
         </w:rPr>
       </w:pPr>
@@ -1067,7 +1428,23 @@
           <w:rFonts w:hint="cs"/>
           <w:rtl/>
         </w:rPr>
-        <w:t>ניקח רק חלק מהדאטא שהשתמשו בו.</w:t>
+        <w:t xml:space="preserve">ניקח רק חלק </w:t>
+      </w:r>
+      <w:proofErr w:type="spellStart"/>
+      <w:r>
+        <w:rPr>
+          <w:rFonts w:hint="cs"/>
+          <w:rtl/>
+        </w:rPr>
+        <w:t>מהדאטא</w:t>
+      </w:r>
+      <w:proofErr w:type="spellEnd"/>
+      <w:r>
+        <w:rPr>
+          <w:rFonts w:hint="cs"/>
+          <w:rtl/>
+        </w:rPr>
+        <w:t xml:space="preserve"> שהשתמשו בו.</w:t>
       </w:r>
     </w:p>
     <w:sectPr>
@@ -1487,6 +1864,7 @@
   <w:style w:type="character" w:default="1" w:styleId="a0">
     <w:name w:val="Default Paragraph Font"/>
     <w:uiPriority w:val="1"/>
+    <w:semiHidden/>
     <w:unhideWhenUsed/>
   </w:style>
   <w:style w:type="table" w:default="1" w:styleId="a1">

</xml_diff>